<commit_message>
fix(template exclusividade): remove parágrafos vazios extras antes do selo do Contratante
No template exclusividade_digital_sem_testemunhas.docx, a tag
{{CONTRATANTE_ASSINATURA_DIGITAL}} tinha 3 parágrafos vazios
(estilo SemEspaçamento) empilhados logo antes dela, enquanto a tag
{{USUARIO_ASSINATURA_DIGITAL}} (Contratado) tinha só 1 - fazendo o
selo do Contratante aparecer visivelmente mais longe do texto acima
dele que o do Contratado, mesmo os dois sendo assinatura 100% digital
(mesmo código/espaçamento de parágrafo do lado do gerador do selo).

Reduzido de 3 para 1 parágrafo vazio antes da tag do Contratante,
igualando à quantidade usada antes da tag do Contratado.

Nota: o app busca este arquivo do bucket 'contract-templates' no
Supabase Storage, não deste repositório diretamente - é necessário
reenviar o .docx corrigido pelo Gerenciador de Templates do app (ou
pelo Supabase Dashboard) para o efeito valer em produção.
</commit_message>
<xml_diff>
--- a/templates/exclusividade_digital_sem_testemunhas.docx
+++ b/templates/exclusividade_digital_sem_testemunhas.docx
@@ -1086,28 +1086,6 @@
     </w:p>
     <w:p>
       <w:pPr>
-        <w:pStyle w:val="SemEspaamento"/>
-        <w:jc w:val="center"/>
-        <w:rPr>
-          <w:b/>
-          <w:sz w:val="24"/>
-          <w:szCs w:val="24"/>
-        </w:rPr>
-      </w:pPr>
-    </w:p>
-    <w:p>
-      <w:pPr>
-        <w:pStyle w:val="SemEspaamento"/>
-        <w:jc w:val="center"/>
-        <w:rPr>
-          <w:b/>
-          <w:sz w:val="24"/>
-          <w:szCs w:val="24"/>
-        </w:rPr>
-      </w:pPr>
-    </w:p>
-    <w:p>
-      <w:pPr>
         <w:jc w:val="center"/>
         <w:rPr>
           <w:rFonts w:asciiTheme="minorHAnsi" w:hAnsiTheme="minorHAnsi"/>

</xml_diff>